<commit_message>
resume: add PDF, nest clients under MojoTech, add earlier clients line
</commit_message>
<xml_diff>
--- a/static/adam_robinson.docx
+++ b/static/adam_robinson.docx
@@ -161,14 +161,23 @@
     </w:p>
     <w:p>
       <w:pPr>
-        <w:spacing w:before="160" w:after="20"/>
+        <w:spacing w:before="100" w:after="20"/>
+        <w:ind w:left="259"/>
       </w:pPr>
+      <w:r>
+        <w:rPr>
+          <w:rFonts w:ascii="Calibri" w:hAnsi="Calibri"/>
+          <w:color w:val="2A7A7A"/>
+          <w:sz w:val="18"/>
+        </w:rPr>
+        <w:t xml:space="preserve">▸  </w:t>
+      </w:r>
       <w:r>
         <w:rPr>
           <w:rFonts w:ascii="Calibri" w:hAnsi="Calibri"/>
           <w:b/>
           <w:color w:val="0A0A0A"/>
-          <w:sz w:val="20"/>
+          <w:sz w:val="19"/>
         </w:rPr>
         <w:t>iCapital</w:t>
       </w:r>
@@ -177,47 +186,44 @@
           <w:rFonts w:ascii="Calibri" w:hAnsi="Calibri"/>
           <w:b w:val="0"/>
           <w:color w:val="444444"/>
-          <w:sz w:val="20"/>
+          <w:sz w:val="18"/>
         </w:rPr>
-        <w:t xml:space="preserve">  ·  Staff Augmentation / Senior Engineer</w:t>
+        <w:t xml:space="preserve">  ·  Staff Augmentation / Senior Engineer  ·  2024 – present</w:t>
       </w:r>
     </w:p>
     <w:p>
       <w:pPr>
-        <w:spacing w:before="0" w:after="80"/>
-      </w:pPr>
-      <w:r>
-        <w:rPr>
-          <w:rFonts w:ascii="JetBrains Mono" w:hAnsi="JetBrains Mono"/>
-          <w:color w:val="444444"/>
-          <w:sz w:val="16"/>
-        </w:rPr>
-        <w:t>2024 – present</w:t>
-      </w:r>
-    </w:p>
-    <w:p>
-      <w:pPr>
-        <w:spacing w:before="0" w:after="80"/>
+        <w:spacing w:before="0" w:after="60"/>
+        <w:ind w:left="504"/>
       </w:pPr>
       <w:r>
         <w:rPr>
           <w:rFonts w:ascii="Calibri" w:hAnsi="Calibri"/>
           <w:color w:val="0A0A0A"/>
-          <w:sz w:val="20"/>
+          <w:sz w:val="19"/>
         </w:rPr>
         <w:t>Embedded on a large-scale alternative investment platform serving wealth managers. Expanded i18n support across static and database-backed content, co-designed a Rails service for bulk nominee investment processing, and led a component library migration (Supernova v1 → v2).</w:t>
       </w:r>
     </w:p>
     <w:p>
       <w:pPr>
-        <w:spacing w:before="160" w:after="20"/>
+        <w:spacing w:before="100" w:after="20"/>
+        <w:ind w:left="259"/>
       </w:pPr>
+      <w:r>
+        <w:rPr>
+          <w:rFonts w:ascii="Calibri" w:hAnsi="Calibri"/>
+          <w:color w:val="2A7A7A"/>
+          <w:sz w:val="18"/>
+        </w:rPr>
+        <w:t xml:space="preserve">▸  </w:t>
+      </w:r>
       <w:r>
         <w:rPr>
           <w:rFonts w:ascii="Calibri" w:hAnsi="Calibri"/>
           <w:b/>
           <w:color w:val="0A0A0A"/>
-          <w:sz w:val="20"/>
+          <w:sz w:val="19"/>
         </w:rPr>
         <w:t>Healthcasts</w:t>
       </w:r>
@@ -226,47 +232,44 @@
           <w:rFonts w:ascii="Calibri" w:hAnsi="Calibri"/>
           <w:b w:val="0"/>
           <w:color w:val="444444"/>
-          <w:sz w:val="20"/>
+          <w:sz w:val="18"/>
         </w:rPr>
-        <w:t xml:space="preserve">  ·  Technical Lead</w:t>
+        <w:t xml:space="preserve">  ·  Technical Lead  ·  2022 – 2024</w:t>
       </w:r>
     </w:p>
     <w:p>
       <w:pPr>
-        <w:spacing w:before="0" w:after="80"/>
-      </w:pPr>
-      <w:r>
-        <w:rPr>
-          <w:rFonts w:ascii="JetBrains Mono" w:hAnsi="JetBrains Mono"/>
-          <w:color w:val="444444"/>
-          <w:sz w:val="16"/>
-        </w:rPr>
-        <w:t>2022 – 2024</w:t>
-      </w:r>
-    </w:p>
-    <w:p>
-      <w:pPr>
-        <w:spacing w:before="0" w:after="80"/>
+        <w:spacing w:before="0" w:after="60"/>
+        <w:ind w:left="504"/>
       </w:pPr>
       <w:r>
         <w:rPr>
           <w:rFonts w:ascii="Calibri" w:hAnsi="Calibri"/>
           <w:color w:val="0A0A0A"/>
-          <w:sz w:val="20"/>
+          <w:sz w:val="19"/>
         </w:rPr>
         <w:t>Led platform modernization for a medical publishing company. Built a headless CMS publishing pipeline (Strapi + React), rebuilt AWS infrastructure, and delivered an Auth0 authentication overhaul unifying login across all platforms — unblocking a parallel AI initiative in the process.</w:t>
       </w:r>
     </w:p>
     <w:p>
       <w:pPr>
-        <w:spacing w:before="160" w:after="20"/>
+        <w:spacing w:before="100" w:after="20"/>
+        <w:ind w:left="259"/>
       </w:pPr>
+      <w:r>
+        <w:rPr>
+          <w:rFonts w:ascii="Calibri" w:hAnsi="Calibri"/>
+          <w:color w:val="2A7A7A"/>
+          <w:sz w:val="18"/>
+        </w:rPr>
+        <w:t xml:space="preserve">▸  </w:t>
+      </w:r>
       <w:r>
         <w:rPr>
           <w:rFonts w:ascii="Calibri" w:hAnsi="Calibri"/>
           <w:b/>
           <w:color w:val="0A0A0A"/>
-          <w:sz w:val="20"/>
+          <w:sz w:val="19"/>
         </w:rPr>
         <w:t>Angi</w:t>
       </w:r>
@@ -275,47 +278,44 @@
           <w:rFonts w:ascii="Calibri" w:hAnsi="Calibri"/>
           <w:b w:val="0"/>
           <w:color w:val="444444"/>
-          <w:sz w:val="20"/>
+          <w:sz w:val="18"/>
         </w:rPr>
-        <w:t xml:space="preserve">  ·  Staff Augmentation / Senior Engineer</w:t>
+        <w:t xml:space="preserve">  ·  Staff Augmentation / Senior Engineer  ·  2021 – 2022</w:t>
       </w:r>
     </w:p>
     <w:p>
       <w:pPr>
-        <w:spacing w:before="0" w:after="80"/>
-      </w:pPr>
-      <w:r>
-        <w:rPr>
-          <w:rFonts w:ascii="JetBrains Mono" w:hAnsi="JetBrains Mono"/>
-          <w:color w:val="444444"/>
-          <w:sz w:val="16"/>
-        </w:rPr>
-        <w:t>2021 – 2022</w:t>
-      </w:r>
-    </w:p>
-    <w:p>
-      <w:pPr>
-        <w:spacing w:before="0" w:after="80"/>
+        <w:spacing w:before="0" w:after="60"/>
+        <w:ind w:left="504"/>
       </w:pPr>
       <w:r>
         <w:rPr>
           <w:rFonts w:ascii="Calibri" w:hAnsi="Calibri"/>
           <w:color w:val="0A0A0A"/>
-          <w:sz w:val="20"/>
+          <w:sz w:val="19"/>
         </w:rPr>
         <w:t>Delivered across three separate codebases (HomeAdvisor, Handy, Angie's List) in a single engagement — Vue/Java, Rails/React, and Next.js/Contentful. Mentored a team of interns through their first fully shipped feature.</w:t>
       </w:r>
     </w:p>
     <w:p>
       <w:pPr>
-        <w:spacing w:before="160" w:after="20"/>
+        <w:spacing w:before="100" w:after="20"/>
+        <w:ind w:left="259"/>
       </w:pPr>
+      <w:r>
+        <w:rPr>
+          <w:rFonts w:ascii="Calibri" w:hAnsi="Calibri"/>
+          <w:color w:val="2A7A7A"/>
+          <w:sz w:val="18"/>
+        </w:rPr>
+        <w:t xml:space="preserve">▸  </w:t>
+      </w:r>
       <w:r>
         <w:rPr>
           <w:rFonts w:ascii="Calibri" w:hAnsi="Calibri"/>
           <w:b/>
           <w:color w:val="0A0A0A"/>
-          <w:sz w:val="20"/>
+          <w:sz w:val="19"/>
         </w:rPr>
         <w:t>Shell Techworks</w:t>
       </w:r>
@@ -324,35 +324,38 @@
           <w:rFonts w:ascii="Calibri" w:hAnsi="Calibri"/>
           <w:b w:val="0"/>
           <w:color w:val="444444"/>
-          <w:sz w:val="20"/>
+          <w:sz w:val="18"/>
         </w:rPr>
-        <w:t xml:space="preserve">  ·  Software Engineer</w:t>
+        <w:t xml:space="preserve">  ·  Software Engineer  ·  2018 – 2019</w:t>
       </w:r>
     </w:p>
     <w:p>
       <w:pPr>
-        <w:spacing w:before="0" w:after="80"/>
-      </w:pPr>
-      <w:r>
-        <w:rPr>
-          <w:rFonts w:ascii="JetBrains Mono" w:hAnsi="JetBrains Mono"/>
-          <w:color w:val="444444"/>
-          <w:sz w:val="16"/>
-        </w:rPr>
-        <w:t>2018 – 2019</w:t>
-      </w:r>
-    </w:p>
-    <w:p>
-      <w:pPr>
-        <w:spacing w:before="0" w:after="80"/>
+        <w:spacing w:before="0" w:after="60"/>
+        <w:ind w:left="504"/>
       </w:pPr>
       <w:r>
         <w:rPr>
           <w:rFonts w:ascii="Calibri" w:hAnsi="Calibri"/>
           <w:color w:val="0A0A0A"/>
-          <w:sz w:val="20"/>
+          <w:sz w:val="19"/>
         </w:rPr>
         <w:t>Built decommissioning tooling for end-of-life offshore oil platforms. Full-stack React/Node application. Used the Google Design Sprint process to compress scope and deliver MVP on schedule onsite in Boston.</w:t>
+      </w:r>
+    </w:p>
+    <w:p>
+      <w:pPr>
+        <w:spacing w:before="120" w:after="120"/>
+        <w:ind w:left="504"/>
+      </w:pPr>
+      <w:r>
+        <w:rPr>
+          <w:rFonts w:ascii="Calibri" w:hAnsi="Calibri"/>
+          <w:i/>
+          <w:color w:val="444444"/>
+          <w:sz w:val="18"/>
+        </w:rPr>
+        <w:t>Earlier clients include School of Motion, Amica Mutual, and AutoRaptor.</w:t>
       </w:r>
     </w:p>
     <w:p>

</xml_diff>

<commit_message>
Update resume employment history
</commit_message>
<xml_diff>
--- a/static/adam_robinson.docx
+++ b/static/adam_robinson.docx
@@ -44,20 +44,80 @@
     </w:p>
     <w:p>
       <w:pPr>
-        <w:spacing w:before="0" w:after="200"/>
+        <w:spacing w:before="0" w:after="160"/>
       </w:pPr>
+      <w:hyperlink r:id="rId9">
+        <w:r>
+          <w:rPr>
+            <w:rFonts w:ascii="Calibri" w:hAnsi="Calibri"/>
+            <w:sz w:val="18"/>
+            <w:color w:val="444444"/>
+            <w:u w:val="none"/>
+          </w:rPr>
+          <w:t>adamrobinson.tech</w:t>
+        </w:r>
+      </w:hyperlink>
       <w:r>
         <w:rPr>
           <w:rFonts w:ascii="Calibri" w:hAnsi="Calibri"/>
           <w:color w:val="444444"/>
           <w:sz w:val="18"/>
         </w:rPr>
-        <w:t>adamrobinson.tech  ·  github.com/aaddaamm  ·  linkedin.com/in/adam-robinson-software  ·  adam@adamrobinson.tech</w:t>
+        <w:t xml:space="preserve">  ·  </w:t>
       </w:r>
+      <w:hyperlink r:id="rId10">
+        <w:r>
+          <w:rPr>
+            <w:rFonts w:ascii="Calibri" w:hAnsi="Calibri"/>
+            <w:sz w:val="18"/>
+            <w:color w:val="444444"/>
+            <w:u w:val="none"/>
+          </w:rPr>
+          <w:t>GitHub</w:t>
+        </w:r>
+      </w:hyperlink>
+      <w:r>
+        <w:rPr>
+          <w:rFonts w:ascii="Calibri" w:hAnsi="Calibri"/>
+          <w:color w:val="444444"/>
+          <w:sz w:val="18"/>
+        </w:rPr>
+        <w:t xml:space="preserve">  ·  </w:t>
+      </w:r>
+      <w:hyperlink r:id="rId11">
+        <w:r>
+          <w:rPr>
+            <w:rFonts w:ascii="Calibri" w:hAnsi="Calibri"/>
+            <w:sz w:val="18"/>
+            <w:color w:val="444444"/>
+            <w:u w:val="none"/>
+          </w:rPr>
+          <w:t>LinkedIn</w:t>
+        </w:r>
+      </w:hyperlink>
+      <w:r>
+        <w:rPr>
+          <w:rFonts w:ascii="Calibri" w:hAnsi="Calibri"/>
+          <w:color w:val="444444"/>
+          <w:sz w:val="18"/>
+        </w:rPr>
+        <w:t xml:space="preserve">  ·  </w:t>
+      </w:r>
+      <w:hyperlink r:id="rId12">
+        <w:r>
+          <w:rPr>
+            <w:rFonts w:ascii="Calibri" w:hAnsi="Calibri"/>
+            <w:sz w:val="18"/>
+            <w:color w:val="444444"/>
+            <w:u w:val="none"/>
+          </w:rPr>
+          <w:t>adam@adamrobinson.tech</w:t>
+        </w:r>
+      </w:hyperlink>
     </w:p>
     <w:p>
       <w:pPr>
-        <w:spacing w:before="120" w:after="120"/>
+        <w:spacing w:before="100" w:after="100"/>
         <w:pBdr>
           <w:bottom w:val="single" w:sz="4" w:space="1" w:color="2A7A7A"/>
         </w:pBdr>
@@ -86,12 +146,12 @@
           <w:color w:val="0A0A0A"/>
           <w:sz w:val="20"/>
         </w:rPr>
-        <w:t>Senior software engineer with over a decade of experience across fintech, healthcare, and enterprise. Full-stack, backend-leaning — specializing in Rails, Node.js, and TypeScript. Embeds with existing teams, gets up to speed fast in complex codebases, and ships reliably. Daily user of AI-assisted development tools.</w:t>
+        <w:t>Senior software engineer and technical lead with 15+ years delivering and modernizing production systems across fintech, healthcare, and enterprise. Backend-leaning full-stack engineer across Rails, TypeScript/Node.js, and React. Ramps quickly in complex codebases, turns ambiguous work into shippable plans, and builds agent-assisted workflows with explicit review and verification.</w:t>
       </w:r>
     </w:p>
     <w:p>
       <w:pPr>
-        <w:spacing w:before="120" w:after="120"/>
+        <w:spacing w:before="100" w:after="100"/>
         <w:pBdr>
           <w:bottom w:val="single" w:sz="4" w:space="1" w:color="2A7A7A"/>
         </w:pBdr>
@@ -143,7 +203,7 @@
           <w:color w:val="444444"/>
           <w:sz w:val="16"/>
         </w:rPr>
-        <w:t>2015 – Present  ·  Providence, RI</w:t>
+        <w:t>Feb 2015 - Present  ·  Providence, RI</w:t>
       </w:r>
     </w:p>
     <w:p>
@@ -156,7 +216,7 @@
           <w:color w:val="0A0A0A"/>
           <w:sz w:val="20"/>
         </w:rPr>
-        <w:t>Delivered across dozens of client engagements as an embedded senior engineer and technical lead. Selected clients:</w:t>
+        <w:t>Delivered 15+ client projects as an embedded senior engineer and technical lead across product delivery, platform modernization, and production systems. Selected clients:</w:t>
       </w:r>
     </w:p>
     <w:p>
@@ -170,7 +230,7 @@
           <w:color w:val="2A7A7A"/>
           <w:sz w:val="18"/>
         </w:rPr>
-        <w:t xml:space="preserve">▸  </w:t>
+        <w:t xml:space="preserve">-  </w:t>
       </w:r>
       <w:r>
         <w:rPr>
@@ -188,7 +248,7 @@
           <w:color w:val="444444"/>
           <w:sz w:val="18"/>
         </w:rPr>
-        <w:t xml:space="preserve">  ·  Staff Augmentation / Senior Engineer  ·  2024 – present</w:t>
+        <w:t xml:space="preserve">  ·  Senior Software Engineer, Consultant  ·  May 2024 - present</w:t>
       </w:r>
     </w:p>
     <w:p>
@@ -202,7 +262,7 @@
           <w:color w:val="0A0A0A"/>
           <w:sz w:val="19"/>
         </w:rPr>
-        <w:t>Embedded on a large-scale alternative investment platform serving wealth managers. Expanded i18n support across static and database-backed content, co-designed a Rails service for bulk nominee investment processing, and led a component library migration (Supernova v1 → v2).</w:t>
+        <w:t>Co-designed a Rails service that consolidated bulk nominee processing for thousands of investments. Expanded localization across static and database-backed content and led the team's Supernova v1-to-v2 component library migration.</w:t>
       </w:r>
     </w:p>
     <w:p>
@@ -216,7 +276,7 @@
           <w:color w:val="2A7A7A"/>
           <w:sz w:val="18"/>
         </w:rPr>
-        <w:t xml:space="preserve">▸  </w:t>
+        <w:t xml:space="preserve">-  </w:t>
       </w:r>
       <w:r>
         <w:rPr>
@@ -234,7 +294,7 @@
           <w:color w:val="444444"/>
           <w:sz w:val="18"/>
         </w:rPr>
-        <w:t xml:space="preserve">  ·  Technical Lead  ·  2022 – 2024</w:t>
+        <w:t xml:space="preserve">  ·  Technical Lead  ·  Oct 2022 - May 2024</w:t>
       </w:r>
     </w:p>
     <w:p>
@@ -248,7 +308,7 @@
           <w:color w:val="0A0A0A"/>
           <w:sz w:val="19"/>
         </w:rPr>
-        <w:t>Led platform modernization for a medical publishing company. Built a headless CMS publishing pipeline (Strapi + React), rebuilt AWS infrastructure, and delivered an Auth0 authentication overhaul unifying login across all platforms — unblocking a parallel AI initiative in the process.</w:t>
+        <w:t>Led phased modernization of a medical publishing platform. Built a Strapi and React publishing pipeline, modernized AWS infrastructure, and unified authentication across products with Auth0, improving publishing throughput and unblocking an AI initiative.</w:t>
       </w:r>
     </w:p>
     <w:p>
@@ -262,7 +322,7 @@
           <w:color w:val="2A7A7A"/>
           <w:sz w:val="18"/>
         </w:rPr>
-        <w:t xml:space="preserve">▸  </w:t>
+        <w:t xml:space="preserve">-  </w:t>
       </w:r>
       <w:r>
         <w:rPr>
@@ -280,7 +340,7 @@
           <w:color w:val="444444"/>
           <w:sz w:val="18"/>
         </w:rPr>
-        <w:t xml:space="preserve">  ·  Staff Augmentation / Senior Engineer  ·  2021 – 2022</w:t>
+        <w:t xml:space="preserve">  ·  Senior Software Engineer, Consultant  ·  Nov 2020 - Sep 2022</w:t>
       </w:r>
     </w:p>
     <w:p>
@@ -294,7 +354,7 @@
           <w:color w:val="0A0A0A"/>
           <w:sz w:val="19"/>
         </w:rPr>
-        <w:t>Delivered across three separate codebases (HomeAdvisor, Handy, Angie's List) in a single engagement — Vue/Java, Rails/React, and Next.js/Contentful. Mentored a team of interns through their first fully shipped feature.</w:t>
+        <w:t>Shipped across three post-merger codebases for HomeAdvisor, Handy, and Angie's List using Vue/Java, Rails/React, and Next.js/Contentful. Mentored interns through a live Careers page launch and their first production release.</w:t>
       </w:r>
     </w:p>
     <w:p>
@@ -308,7 +368,7 @@
           <w:color w:val="2A7A7A"/>
           <w:sz w:val="18"/>
         </w:rPr>
-        <w:t xml:space="preserve">▸  </w:t>
+        <w:t xml:space="preserve">-  </w:t>
       </w:r>
       <w:r>
         <w:rPr>
@@ -326,7 +386,7 @@
           <w:color w:val="444444"/>
           <w:sz w:val="18"/>
         </w:rPr>
-        <w:t xml:space="preserve">  ·  Software Engineer  ·  2018 – 2019</w:t>
+        <w:t xml:space="preserve">  ·  Software Engineer  ·  Jun 2018 - Jul 2019</w:t>
       </w:r>
     </w:p>
     <w:p>
@@ -340,7 +400,7 @@
           <w:color w:val="0A0A0A"/>
           <w:sz w:val="19"/>
         </w:rPr>
-        <w:t>Built decommissioning tooling for end-of-life offshore oil platforms. Full-stack React/Node application. Used the Google Design Sprint process to compress scope and deliver MVP on schedule onsite in Boston.</w:t>
+        <w:t>Built a React and Node.js application that evaluated least-cost decommissioning paths for end-of-life offshore oil platforms. Used an onsite Google Design Sprint to narrow scope and deliver the MVP on schedule.</w:t>
       </w:r>
     </w:p>
     <w:p>
@@ -378,7 +438,7 @@
           <w:color w:val="444444"/>
           <w:sz w:val="20"/>
         </w:rPr>
-        <w:t xml:space="preserve">  ·  Software Engineer</w:t>
+        <w:t xml:space="preserve">  ·  Associate Developer / Production Control</w:t>
       </w:r>
     </w:p>
     <w:p>
@@ -391,7 +451,7 @@
           <w:color w:val="444444"/>
           <w:sz w:val="16"/>
         </w:rPr>
-        <w:t>2013 – 2016  ·  Warwick, RI</w:t>
+        <w:t>Mar 2011 - Feb 2015  ·  Warwick, RI</w:t>
       </w:r>
     </w:p>
     <w:p>
@@ -404,12 +464,12 @@
           <w:color w:val="0A0A0A"/>
           <w:sz w:val="20"/>
         </w:rPr>
-        <w:t>Built backend systems for claims and policy management in a regulated, high-reliability environment. Designed financial transaction and payment processing systems with strong correctness requirements.</w:t>
+        <w:t>Progressed from deployment and environment management to full-stack and database development, building claims, policy, financial transaction, and payment systems in a regulated environment.</w:t>
       </w:r>
     </w:p>
     <w:p>
       <w:pPr>
-        <w:spacing w:before="120" w:after="120"/>
+        <w:spacing w:before="100" w:after="100"/>
         <w:pBdr>
           <w:bottom w:val="single" w:sz="4" w:space="1" w:color="2A7A7A"/>
         </w:pBdr>
@@ -430,7 +490,7 @@
     </w:p>
     <w:p>
       <w:pPr>
-        <w:spacing w:before="0" w:after="60"/>
+        <w:spacing w:before="0" w:after="40"/>
       </w:pPr>
       <w:r>
         <w:rPr>
@@ -451,7 +511,7 @@
     </w:p>
     <w:p>
       <w:pPr>
-        <w:spacing w:before="0" w:after="60"/>
+        <w:spacing w:before="0" w:after="40"/>
       </w:pPr>
       <w:r>
         <w:rPr>
@@ -472,7 +532,7 @@
     </w:p>
     <w:p>
       <w:pPr>
-        <w:spacing w:before="0" w:after="60"/>
+        <w:spacing w:before="0" w:after="40"/>
       </w:pPr>
       <w:r>
         <w:rPr>
@@ -480,7 +540,7 @@
           <w:color w:val="2A7A7A"/>
           <w:sz w:val="18"/>
         </w:rPr>
-        <w:t xml:space="preserve">Cloud       </w:t>
+        <w:t xml:space="preserve">Platform    </w:t>
       </w:r>
       <w:r>
         <w:rPr>
@@ -488,33 +548,12 @@
           <w:color w:val="444444"/>
           <w:sz w:val="20"/>
         </w:rPr>
-        <w:t>AWS  ·  Vercel  ·  GitHub Actions</w:t>
+        <w:t>AWS, Vercel, GitHub Actions  ·  Git, Prisma, Strapi, Contentful, Auth0</w:t>
       </w:r>
     </w:p>
     <w:p>
       <w:pPr>
-        <w:spacing w:before="0" w:after="60"/>
-      </w:pPr>
-      <w:r>
-        <w:rPr>
-          <w:rFonts w:ascii="JetBrains Mono" w:hAnsi="JetBrains Mono"/>
-          <w:color w:val="2A7A7A"/>
-          <w:sz w:val="18"/>
-        </w:rPr>
-        <w:t xml:space="preserve">Tools       </w:t>
-      </w:r>
-      <w:r>
-        <w:rPr>
-          <w:rFonts w:ascii="Calibri" w:hAnsi="Calibri"/>
-          <w:color w:val="444444"/>
-          <w:sz w:val="20"/>
-        </w:rPr>
-        <w:t>Git, Prisma, Strapi, Contentful, Auth0</w:t>
-      </w:r>
-    </w:p>
-    <w:p>
-      <w:pPr>
-        <w:spacing w:before="0" w:after="60"/>
+        <w:spacing w:before="0" w:after="40"/>
       </w:pPr>
       <w:r>
         <w:rPr>
@@ -530,12 +569,12 @@
           <w:color w:val="444444"/>
           <w:sz w:val="20"/>
         </w:rPr>
-        <w:t>GitHub Copilot, Claude, AMP  (daily — VS Code / Zed)</w:t>
+        <w:t>Codex, Claude, Pi, GitHub Copilot  ·  agent instructions, skills, verification workflows</w:t>
       </w:r>
     </w:p>
     <w:sectPr>
       <w:pgSz w:w="12240" w:h="15840"/>
-      <w:pgMar w:top="1080" w:right="1296" w:bottom="1080" w:left="1296" w:header="720" w:footer="720" w:gutter="0"/>
+      <w:pgMar w:top="936" w:right="1296" w:bottom="936" w:left="1296" w:header="720" w:footer="720" w:gutter="0"/>
       <w:cols w:space="720"/>
       <w:docGrid w:linePitch="360"/>
     </w:sectPr>

</xml_diff>

<commit_message>
Refresh site and resume positioning
</commit_message>
<xml_diff>
--- a/static/adam_robinson.docx
+++ b/static/adam_robinson.docx
@@ -146,7 +146,7 @@
           <w:color w:val="0A0A0A"/>
           <w:sz w:val="20"/>
         </w:rPr>
-        <w:t>Senior software engineer and technical lead with 15+ years delivering and modernizing production systems across fintech, healthcare, and enterprise. Backend-leaning full-stack engineer across Rails, TypeScript/Node.js, and React. Ramps quickly in complex codebases, turns ambiguous work into shippable plans, and builds agent-assisted workflows with explicit review and verification.</w:t>
+        <w:t>Senior software engineer and technical lead with 15+ years delivering production systems across 15+ client engagements. Full-stack work in React, TypeScript/Node.js, and Rails across fintech, healthcare, industrial technology, and enterprise products. Recent work includes Rails bulk processing for nominee investments and a Strapi/React publishing pipeline with unified Auth0 login.</w:t>
       </w:r>
     </w:p>
     <w:p>
@@ -216,7 +216,7 @@
           <w:color w:val="0A0A0A"/>
           <w:sz w:val="20"/>
         </w:rPr>
-        <w:t>Delivered 15+ client projects as an embedded senior engineer and technical lead across product delivery, platform modernization, and production systems. Selected clients:</w:t>
+        <w:t>Delivered 15+ client projects as an embedded senior engineer and technical lead. Selected clients:</w:t>
       </w:r>
     </w:p>
     <w:p>
@@ -308,7 +308,7 @@
           <w:color w:val="0A0A0A"/>
           <w:sz w:val="19"/>
         </w:rPr>
-        <w:t>Led phased modernization of a medical publishing platform. Built a Strapi and React publishing pipeline, modernized AWS infrastructure, and unified authentication across products with Auth0, improving publishing throughput and unblocking an AI initiative.</w:t>
+        <w:t>Led phased modernization of a medical publishing platform. Built a Strapi/React publishing pipeline and updated AWS infrastructure and frameworks. Unified authentication across products with Auth0, reducing publishing friction and unblocking an AI initiative.</w:t>
       </w:r>
     </w:p>
     <w:p>
@@ -354,7 +354,7 @@
           <w:color w:val="0A0A0A"/>
           <w:sz w:val="19"/>
         </w:rPr>
-        <w:t>Shipped across three post-merger codebases for HomeAdvisor, Handy, and Angie's List using Vue/Java, Rails/React, and Next.js/Contentful. Mentored interns through a live Careers page launch and their first production release.</w:t>
+        <w:t>Shipped across three post-merger codebases for HomeAdvisor, Handy, and Angie's List using Vue/Java, Rails/React, and Next.js/Contentful. Mentored interns through their first production release, a Careers page revamp.</w:t>
       </w:r>
     </w:p>
     <w:p>

</xml_diff>

<commit_message>
Clarify technical leadership and align resume experience
</commit_message>
<xml_diff>
--- a/static/adam_robinson.docx
+++ b/static/adam_robinson.docx
@@ -4,21 +4,22 @@
   <w:body>
     <w:p>
       <w:pPr>
-        <w:spacing w:before="0" w:after="40"/>
+        <w:pStyle w:val="Title"/>
+        <w:spacing w:line="240" w:lineRule="auto" w:before="0" w:after="40"/>
       </w:pPr>
       <w:r>
         <w:rPr>
           <w:rFonts w:ascii="JetBrains Mono" w:hAnsi="JetBrains Mono"/>
           <w:b w:val="0"/>
           <w:color w:val="0A0A0A"/>
-          <w:sz w:val="52"/>
+          <w:sz w:val="44"/>
         </w:rPr>
-        <w:t>adam robinson</w:t>
+        <w:t>Adam Robinson</w:t>
       </w:r>
     </w:p>
     <w:p>
       <w:pPr>
-        <w:spacing w:before="0" w:after="80"/>
+        <w:spacing w:line="240" w:lineRule="auto" w:before="0" w:after="80"/>
       </w:pPr>
       <w:r>
         <w:rPr>
@@ -31,7 +32,7 @@
     </w:p>
     <w:p>
       <w:pPr>
-        <w:spacing w:before="0" w:after="40"/>
+        <w:spacing w:line="240" w:lineRule="auto" w:before="0" w:after="40"/>
       </w:pPr>
       <w:r>
         <w:rPr>
@@ -44,7 +45,7 @@
     </w:p>
     <w:p>
       <w:pPr>
-        <w:spacing w:before="0" w:after="160"/>
+        <w:spacing w:line="240" w:lineRule="auto" w:before="0" w:after="160"/>
       </w:pPr>
       <w:hyperlink r:id="rId9">
         <w:r>
@@ -117,7 +118,7 @@
     </w:p>
     <w:p>
       <w:pPr>
-        <w:spacing w:before="100" w:after="100"/>
+        <w:spacing w:line="240" w:lineRule="auto" w:before="100" w:after="100"/>
         <w:pBdr>
           <w:bottom w:val="single" w:sz="4" w:space="1" w:color="2A7A7A"/>
         </w:pBdr>
@@ -125,7 +126,7 @@
     </w:p>
     <w:p>
       <w:pPr>
-        <w:spacing w:before="40" w:after="120"/>
+        <w:spacing w:line="240" w:lineRule="auto" w:before="40" w:after="60"/>
       </w:pPr>
       <w:r>
         <w:rPr>
@@ -138,7 +139,7 @@
     </w:p>
     <w:p>
       <w:pPr>
-        <w:spacing w:before="0" w:after="80"/>
+        <w:spacing w:line="240" w:lineRule="auto" w:before="0" w:after="80"/>
       </w:pPr>
       <w:r>
         <w:rPr>
@@ -146,12 +147,12 @@
           <w:color w:val="0A0A0A"/>
           <w:sz w:val="20"/>
         </w:rPr>
-        <w:t>Senior software engineer and technical lead with 15+ years delivering production systems across 15+ client engagements. Full-stack work in React, TypeScript/Node.js, and Rails across fintech, healthcare, industrial technology, and enterprise products. Recent work includes Rails bulk processing for nominee investments and a Strapi/React publishing pipeline with unified Auth0 login.</w:t>
+        <w:t>Senior software engineer and technical lead with 15+ years of experience building production software. My work spans full-stack feature development, backend service architecture, and platform modernization. I combine hands-on development with technical leadership, from defining goals and technical approaches to coordinating delivery and mentoring engineers.</w:t>
       </w:r>
     </w:p>
     <w:p>
       <w:pPr>
-        <w:spacing w:before="100" w:after="100"/>
+        <w:spacing w:line="240" w:lineRule="auto" w:before="100" w:after="100"/>
         <w:pBdr>
           <w:bottom w:val="single" w:sz="4" w:space="1" w:color="2A7A7A"/>
         </w:pBdr>
@@ -159,7 +160,7 @@
     </w:p>
     <w:p>
       <w:pPr>
-        <w:spacing w:before="40" w:after="120"/>
+        <w:spacing w:line="240" w:lineRule="auto" w:before="40" w:after="60"/>
       </w:pPr>
       <w:r>
         <w:rPr>
@@ -172,7 +173,7 @@
     </w:p>
     <w:p>
       <w:pPr>
-        <w:spacing w:before="160" w:after="20"/>
+        <w:spacing w:line="240" w:lineRule="auto" w:before="100" w:after="20"/>
       </w:pPr>
       <w:r>
         <w:rPr>
@@ -195,7 +196,7 @@
     </w:p>
     <w:p>
       <w:pPr>
-        <w:spacing w:before="0" w:after="80"/>
+        <w:spacing w:line="240" w:lineRule="auto" w:before="0" w:after="80"/>
       </w:pPr>
       <w:r>
         <w:rPr>
@@ -208,7 +209,7 @@
     </w:p>
     <w:p>
       <w:pPr>
-        <w:spacing w:before="0" w:after="120"/>
+        <w:spacing w:line="240" w:lineRule="auto" w:before="0" w:after="120"/>
       </w:pPr>
       <w:r>
         <w:rPr>
@@ -216,12 +217,12 @@
           <w:color w:val="0A0A0A"/>
           <w:sz w:val="20"/>
         </w:rPr>
-        <w:t>Delivered 15+ client projects as an embedded senior engineer and technical lead. Selected clients:</w:t>
+        <w:t>Software consultancy. Embedded with client teams across 15+ engagements. Selected client engagements:</w:t>
       </w:r>
     </w:p>
     <w:p>
       <w:pPr>
-        <w:spacing w:before="100" w:after="20"/>
+        <w:spacing w:line="240" w:lineRule="auto" w:before="100" w:after="20"/>
         <w:ind w:left="259"/>
       </w:pPr>
       <w:r>
@@ -253,7 +254,7 @@
     </w:p>
     <w:p>
       <w:pPr>
-        <w:spacing w:before="0" w:after="60"/>
+        <w:spacing w:line="240" w:lineRule="auto" w:before="0" w:after="60"/>
         <w:ind w:left="504"/>
       </w:pPr>
       <w:r>
@@ -262,12 +263,12 @@
           <w:color w:val="0A0A0A"/>
           <w:sz w:val="19"/>
         </w:rPr>
-        <w:t>Co-designed a Rails service that consolidated bulk nominee processing for thousands of investments. Expanded localization across static and database-backed content and led the team's Supernova v1-to-v2 component library migration.</w:t>
+        <w:t>Develop features across iCapital’s investment platform. Helped architect and implement a Rails backend service for the Nominees reimplementation, supporting specialized international investments. Worked on backend translation migration using Mobility. Currently migrating custom frontend forms to a shared internal package.</w:t>
       </w:r>
     </w:p>
     <w:p>
       <w:pPr>
-        <w:spacing w:before="100" w:after="20"/>
+        <w:spacing w:line="240" w:lineRule="auto" w:before="100" w:after="20"/>
         <w:ind w:left="259"/>
       </w:pPr>
       <w:r>
@@ -299,7 +300,7 @@
     </w:p>
     <w:p>
       <w:pPr>
-        <w:spacing w:before="0" w:after="60"/>
+        <w:spacing w:line="240" w:lineRule="auto" w:before="0" w:after="60"/>
         <w:ind w:left="504"/>
       </w:pPr>
       <w:r>
@@ -308,12 +309,12 @@
           <w:color w:val="0A0A0A"/>
           <w:sz w:val="19"/>
         </w:rPr>
-        <w:t>Led phased modernization of a medical publishing platform. Built a Strapi/React publishing pipeline and updated AWS infrastructure and frameworks. Unified authentication across products with Auth0, reducing publishing friction and unblocking an AI initiative.</w:t>
+        <w:t>Led development across publishing, authentication, and AI platform initiatives, helping define goals and technical approaches while implementing throughout. Co-designed and built a headless CMS workflow with another engineer, reducing a core process from weeks to a couple of days. Helped define and led an Auth0 authentication strategy requiring an extensive authentication-layer and backend rewrite. Led development and implemented parts of the AI platform.</w:t>
       </w:r>
     </w:p>
     <w:p>
       <w:pPr>
-        <w:spacing w:before="100" w:after="20"/>
+        <w:spacing w:line="240" w:lineRule="auto" w:before="100" w:after="20"/>
         <w:ind w:left="259"/>
       </w:pPr>
       <w:r>
@@ -345,7 +346,7 @@
     </w:p>
     <w:p>
       <w:pPr>
-        <w:spacing w:before="0" w:after="60"/>
+        <w:spacing w:line="240" w:lineRule="auto" w:before="0" w:after="60"/>
         <w:ind w:left="504"/>
       </w:pPr>
       <w:r>
@@ -354,12 +355,12 @@
           <w:color w:val="0A0A0A"/>
           <w:sz w:val="19"/>
         </w:rPr>
-        <w:t>Shipped across three post-merger codebases for HomeAdvisor, Handy, and Angie's List using Vue/Java, Rails/React, and Next.js/Contentful. Mentored interns through their first production release, a Careers page revamp.</w:t>
+        <w:t>Developed Java/Vue.js features for the unified quiz flow during the Angi rebrand, then React/Rails features at Handy and Contentful/Next.js pages at Angi. Managed interns rebuilding the Careers page, then took over the remaining implementation after their internships ended.</w:t>
       </w:r>
     </w:p>
     <w:p>
       <w:pPr>
-        <w:spacing w:before="100" w:after="20"/>
+        <w:spacing w:line="240" w:lineRule="auto" w:before="100" w:after="20"/>
         <w:ind w:left="259"/>
       </w:pPr>
       <w:r>
@@ -391,7 +392,7 @@
     </w:p>
     <w:p>
       <w:pPr>
-        <w:spacing w:before="0" w:after="60"/>
+        <w:spacing w:line="240" w:lineRule="auto" w:before="0" w:after="60"/>
         <w:ind w:left="504"/>
       </w:pPr>
       <w:r>
@@ -405,7 +406,7 @@
     </w:p>
     <w:p>
       <w:pPr>
-        <w:spacing w:before="120" w:after="120"/>
+        <w:spacing w:line="240" w:lineRule="auto" w:before="120" w:after="60"/>
         <w:ind w:left="504"/>
       </w:pPr>
       <w:r>
@@ -415,12 +416,12 @@
           <w:color w:val="444444"/>
           <w:sz w:val="18"/>
         </w:rPr>
-        <w:t>Earlier clients include School of Motion, Amica Mutual, and AutoRaptor.</w:t>
+        <w:t>Additional client engagements: Two Sigma · Welltok · Credit Karma · Schneider Electric · School of Motion · Amica Mutual · AutoRaptor.</w:t>
       </w:r>
     </w:p>
     <w:p>
       <w:pPr>
-        <w:spacing w:before="160" w:after="20"/>
+        <w:spacing w:line="240" w:lineRule="auto" w:before="100" w:after="20"/>
       </w:pPr>
       <w:r>
         <w:rPr>
@@ -443,7 +444,7 @@
     </w:p>
     <w:p>
       <w:pPr>
-        <w:spacing w:before="0" w:after="80"/>
+        <w:spacing w:line="240" w:lineRule="auto" w:before="0" w:after="80"/>
       </w:pPr>
       <w:r>
         <w:rPr>
@@ -456,7 +457,7 @@
     </w:p>
     <w:p>
       <w:pPr>
-        <w:spacing w:before="0" w:after="80"/>
+        <w:spacing w:line="240" w:lineRule="auto" w:before="0" w:after="80"/>
       </w:pPr>
       <w:r>
         <w:rPr>
@@ -469,7 +470,7 @@
     </w:p>
     <w:p>
       <w:pPr>
-        <w:spacing w:before="100" w:after="100"/>
+        <w:spacing w:line="240" w:lineRule="auto" w:before="100" w:after="100"/>
         <w:pBdr>
           <w:bottom w:val="single" w:sz="4" w:space="1" w:color="2A7A7A"/>
         </w:pBdr>
@@ -477,7 +478,7 @@
     </w:p>
     <w:p>
       <w:pPr>
-        <w:spacing w:before="40" w:after="120"/>
+        <w:spacing w:line="240" w:lineRule="auto" w:before="40" w:after="60"/>
       </w:pPr>
       <w:r>
         <w:rPr>
@@ -490,7 +491,7 @@
     </w:p>
     <w:p>
       <w:pPr>
-        <w:spacing w:before="0" w:after="40"/>
+        <w:spacing w:line="240" w:lineRule="auto" w:before="0" w:after="40"/>
       </w:pPr>
       <w:r>
         <w:rPr>
@@ -498,7 +499,7 @@
           <w:color w:val="2A7A7A"/>
           <w:sz w:val="18"/>
         </w:rPr>
-        <w:t xml:space="preserve">Backend     </w:t>
+        <w:t xml:space="preserve">Core stack  ·  </w:t>
       </w:r>
       <w:r>
         <w:rPr>
@@ -506,12 +507,12 @@
           <w:color w:val="444444"/>
           <w:sz w:val="20"/>
         </w:rPr>
-        <w:t>TypeScript, Ruby, SQL, Elixir  ·  Node.js, Ruby on Rails, Express, Phoenix</w:t>
+        <w:t>TypeScript, React, Ruby on Rails, Node.js, SQL</w:t>
       </w:r>
     </w:p>
     <w:p>
       <w:pPr>
-        <w:spacing w:before="0" w:after="40"/>
+        <w:spacing w:line="240" w:lineRule="auto" w:before="0" w:after="40"/>
       </w:pPr>
       <w:r>
         <w:rPr>
@@ -519,7 +520,7 @@
           <w:color w:val="2A7A7A"/>
           <w:sz w:val="18"/>
         </w:rPr>
-        <w:t xml:space="preserve">Frontend    </w:t>
+        <w:t xml:space="preserve">Delivery range  ·  </w:t>
       </w:r>
       <w:r>
         <w:rPr>
@@ -527,12 +528,12 @@
           <w:color w:val="444444"/>
           <w:sz w:val="20"/>
         </w:rPr>
-        <w:t>React, SvelteKit, Vue, Next.js</w:t>
+        <w:t>Vue, Next.js, SvelteKit, Java, PHP (legacy)</w:t>
       </w:r>
     </w:p>
     <w:p>
       <w:pPr>
-        <w:spacing w:before="0" w:after="40"/>
+        <w:spacing w:line="240" w:lineRule="auto" w:before="0" w:after="40"/>
       </w:pPr>
       <w:r>
         <w:rPr>
@@ -540,7 +541,7 @@
           <w:color w:val="2A7A7A"/>
           <w:sz w:val="18"/>
         </w:rPr>
-        <w:t xml:space="preserve">Platform    </w:t>
+        <w:t xml:space="preserve">Platform work  ·  </w:t>
       </w:r>
       <w:r>
         <w:rPr>
@@ -548,12 +549,12 @@
           <w:color w:val="444444"/>
           <w:sz w:val="20"/>
         </w:rPr>
-        <w:t>AWS, Vercel, GitHub Actions  ·  Git, Prisma, Strapi, Contentful, Auth0</w:t>
+        <w:t>AWS/EC2, GitHub Actions, Auth0, Strapi, Contentful, Mobility</w:t>
       </w:r>
     </w:p>
     <w:p>
       <w:pPr>
-        <w:spacing w:before="0" w:after="40"/>
+        <w:spacing w:line="240" w:lineRule="auto" w:before="0" w:after="40"/>
       </w:pPr>
       <w:r>
         <w:rPr>
@@ -561,7 +562,7 @@
           <w:color w:val="2A7A7A"/>
           <w:sz w:val="18"/>
         </w:rPr>
-        <w:t xml:space="preserve">AI          </w:t>
+        <w:t xml:space="preserve">Leadership  ·  </w:t>
       </w:r>
       <w:r>
         <w:rPr>
@@ -569,7 +570,7 @@
           <w:color w:val="444444"/>
           <w:sz w:val="20"/>
         </w:rPr>
-        <w:t>Codex, Claude, Pi, GitHub Copilot  ·  agent instructions, skills, verification workflows</w:t>
+        <w:t>System design, goal setting, technical approach, delivery coordination, mentoring</w:t>
       </w:r>
     </w:p>
     <w:sectPr>
@@ -1291,9 +1292,6 @@
     <w:qFormat/>
     <w:rsid w:val="00FC693F"/>
     <w:pPr>
-      <w:pBdr>
-        <w:bottom w:val="single" w:sz="8" w:space="4" w:color="4F81BD" w:themeColor="accent1"/>
-      </w:pBdr>
       <w:spacing w:after="300" w:line="240" w:lineRule="auto"/>
       <w:contextualSpacing/>
     </w:pPr>

</xml_diff>